<commit_message>
feat(backend): implement screenshot attachments via multer for enquiries
- Add 'attachments' array field to the Enquiry model
- Configure Multer disk storage engine to process image uploads in 'uploads/'
- Validate uploaded files to accept only images (jpg, jpeg, png, webp)
- Inject Multer upload middleware to 'POST /api/enquiries'
- Update enquiryController to push req.file paths into database records
</commit_message>
<xml_diff>
--- a/documentation/document generation.docx
+++ b/documentation/document generation.docx
@@ -28775,6 +28775,109 @@
       <w:proofErr w:type="spellEnd"/>
       <w:r>
         <w:t xml:space="preserve"> for order placed, quote sent, and order delivered events. Ready when you are.</w:t>
+      </w:r>
+    </w:p>
+    <w:p>
+      <w:r>
+        <w:br/>
+      </w:r>
+      <w:r>
+        <w:br/>
+      </w:r>
+      <w:proofErr w:type="spellStart"/>
+      <w:r>
+        <w:t>i</w:t>
+      </w:r>
+      <w:proofErr w:type="spellEnd"/>
+      <w:r>
+        <w:t xml:space="preserve"> get this error Notification validation failed: type: `payment` is not a valid </w:t>
+      </w:r>
+      <w:proofErr w:type="spellStart"/>
+      <w:r>
+        <w:t>enum</w:t>
+      </w:r>
+      <w:proofErr w:type="spellEnd"/>
+      <w:r>
+        <w:t xml:space="preserve"> value for path `type`. when </w:t>
+      </w:r>
+      <w:proofErr w:type="spellStart"/>
+      <w:r>
+        <w:t>i</w:t>
+      </w:r>
+      <w:proofErr w:type="spellEnd"/>
+      <w:r>
+        <w:t xml:space="preserve"> try to fill in the form at the create payment and confirm payment </w:t>
+      </w:r>
+    </w:p>
+    <w:p>
+      <w:r>
+        <w:t>look :</w:t>
+      </w:r>
+    </w:p>
+    <w:p>
+      <w:r>
+        <w:t>Attach Payment</w:t>
+      </w:r>
+    </w:p>
+    <w:p>
+      <w:r>
+        <w:t xml:space="preserve">Payment record: </w:t>
+      </w:r>
+      <w:proofErr w:type="spellStart"/>
+      <w:r>
+        <w:t>pendingCancel</w:t>
+      </w:r>
+      <w:proofErr w:type="spellEnd"/>
+    </w:p>
+    <w:p>
+      <w:r>
+        <w:t xml:space="preserve">Payment </w:t>
+      </w:r>
+      <w:proofErr w:type="spellStart"/>
+      <w:r>
+        <w:t>MethodM</w:t>
+      </w:r>
+      <w:proofErr w:type="spellEnd"/>
+      <w:r>
+        <w:t xml:space="preserve">-Pesa (Manual)Bank </w:t>
+      </w:r>
+      <w:proofErr w:type="spellStart"/>
+      <w:r>
+        <w:t>TransferCashOther</w:t>
+      </w:r>
+      <w:proofErr w:type="spellEnd"/>
+    </w:p>
+    <w:p>
+      <w:r>
+        <w:t>Paste M-Pesa Confirmation SMS (receipt number extracted automatically)</w:t>
+      </w:r>
+    </w:p>
+    <w:p>
+      <w:r>
+        <w:t>M-Pesa Receipt Number (if not in SMS above)</w:t>
+      </w:r>
+    </w:p>
+    <w:p>
+      <w:r>
+        <w:t>Reference / Transaction ID (bank transfers)</w:t>
+      </w:r>
+    </w:p>
+    <w:p>
+      <w:r>
+        <w:t>Internal Notes (optional)</w:t>
+      </w:r>
+    </w:p>
+    <w:p>
+      <w:r>
+        <w:t xml:space="preserve">Notification validation failed: type: `payment` is not a valid </w:t>
+      </w:r>
+      <w:proofErr w:type="spellStart"/>
+      <w:r>
+        <w:t>enum</w:t>
+      </w:r>
+      <w:proofErr w:type="spellEnd"/>
+      <w:r>
+        <w:t xml:space="preserve"> value for path `type`.</w:t>
       </w:r>
     </w:p>
     <w:p/>

</xml_diff>